<commit_message>
v23.50: attendance matrix — the office-weekend badge carries the 130% rate only for 🏢 Office pay holders (✓ signed / ⏳ unsigned for everyone else); attendance guide stamped; matrix badge test case
Co-Authored-By: Claude Fable 5.1 <noreply@anthropic.com>
Claude-Session: https://claude.ai/code/session_01T49gnSNZq31rPRt1vHk4Rc
</commit_message>
<xml_diff>
--- a/nexidoc/Nexi_User_Guide_v23.50.docx
+++ b/nexidoc/Nexi_User_Guide_v23.50.docx
@@ -3041,7 +3041,7 @@
           <w:color w:val="556660"/>
           <w:sz w:val="19"/>
         </w:rPr>
-        <w:t>Added 13 Sep 2026 · v19.91 — Updated 14 Oct 2026 · v23.34</w:t>
+        <w:t>Added 13 Sep 2026 · v19.91 — Updated 18 Oct 2026 · v23.50</w:t>
       </w:r>
     </w:p>
     <w:p>
@@ -3309,7 +3309,7 @@
     </w:p>
     <w:p>
       <w:r>
-        <w:t>An office Saturday or Sunday that was scanned stays green and carries its own badge. ⏳ unsigned means it waits for its signatures in HR ▸ Weekend Approvals — ① Jinky’s check, then ② the FINAL of Dr Amy or Eyal (either may give ② first); ✓ signed 130% means they have; ✗ refused means they said no. Management and a fixed-fee Consultant, Contractor or Advisor show 'fixed pay': the scan is recorded but never paid. 'Contractual' is not a fixed fee, so those staff get the badge like everybody else. A labour Saturday with a clock scan (fingerprint or timecard) shows as a worked day, exactly as payroll pays it, never as 'Sat rest'. The ✓ totals count attendance, not paid days.</w:t>
+        <w:t>An office Saturday or Sunday that was scanned stays green and carries its own badge. ⏳ unsigned means it waits for its signatures in HR ▸ Weekend Approvals — ① Jinky’s check, then ② the FINAL of Dr Amy or Eyal (either may give ② first); since v23.50 the badge shows the 130% rate (“✓ signed 130%”) only to 🏢 Office pay holders — everyone else reads “✓ signed” / “⏳ unsigned”, and the Weekend Approvals screen itself opens only for those holders; ✓ signed 130% means they have; ✗ refused means they said no. Management and a fixed-fee Consultant, Contractor or Advisor show 'fixed pay': the scan is recorded but never paid. 'Contractual' is not a fixed fee, so those staff get the badge like everybody else. A labour Saturday with a clock scan (fingerprint or timecard) shows as a worked day, exactly as payroll pays it, never as 'Sat rest'. The ✓ totals count attendance, not paid days.</w:t>
       </w:r>
     </w:p>
     <w:p>

</xml_diff>